<commit_message>
feat: add Milky Way Galaxy theme with 3D solar system, update capstone resume, and optimize assets
- Implement Milky Way Galaxy & Visible Solar System theme on galaxyCanvas with 3D inclined perspective, orbiting planets, Sol corona, and differential galactic arms rotation
- Add Milky Way topbar theme switcher pill button and telemetry HUD integration
- Elevate Collegiate BSIT Capstone Thesis to Project #1 across portfolio index, web resume, and Word document
- Integrate WebVTT captions and poster specs for mock job interview video
- Batch optimize 68 crystal gallery assets (190.24 MB / 75.4% bandwidth reduction)
- Add SEO suite (sitemap.xml, robots.txt, JSON-LD Schema.org, Open Graph)
- Enhance accessibility and HTTP 206 streaming support
</commit_message>
<xml_diff>
--- a/assets/docs/Marcial_Lawrence_Jr_V_Resume.docx
+++ b/assets/docs/Marcial_Lawrence_Jr_V_Resume.docx
@@ -228,35 +228,35 @@
         <w:t>FEATURED IT PROJECTS CAPSTONES</w:t>
       </w:r>
     </w:p>
-    <!-- Project 1 -->
-    <w:p>
-      <w:pPr>
-        <w:spacing w:after="20"/>
-      </w:pPr>
-      <w:r>
-        <w:rPr>
-          <w:b/>
-        </w:rPr>
-        <w:t>1 TarotKnight Crystal Art ECommerce Appointment Platform</w:t>
-      </w:r>
-    </w:p>
-    <w:p>
-      <w:pPr>
-        <w:spacing w:after="20"/>
-      </w:pPr>
-      <w:r>
-        <w:rPr>
-          <w:color w:val="1D4ED8"/>
-        </w:rPr>
-        <w:t>Stack JavaScript ES6 Bootstrap 53 PayMongo API JT Express Logistics MySQL 3NF LocalDB Persistence</w:t>
-      </w:r>
-    </w:p>
-    <w:p>
-      <w:pPr>
-        <w:spacing w:after="80"/>
-      </w:pPr>
-      <w:r>
-        <w:t>Engineered an authentic 44item artisanal jewelry catalog with dynamic category filtering across Pendants Bracelets Rings and Earrings Integrated PayMongo test gateway GCash Maya Cards simulated JT Express waybill tracking atomic stock decrementing appointment calendar reservation and an Administrative Control Center monitoring gross settled revenue</w:t>
+    <!-- Project 1 (Collegiate Capstone Thesis) -->
+    <w:p>
+      <w:pPr>
+        <w:spacing w:after="20"/>
+      </w:pPr>
+      <w:r>
+        <w:rPr>
+          <w:b/>
+        </w:rPr>
+        <w:t>1. IoT-Based Smart Science Laboratory Safety, Access Control &amp; Incident Prevention System (Collegiate BSIT Capstone Thesis)</w:t>
+      </w:r>
+    </w:p>
+    <w:p>
+      <w:pPr>
+        <w:spacing w:after="20"/>
+      </w:pPr>
+      <w:r>
+        <w:rPr>
+          <w:color w:val="1D4ED8"/>
+        </w:rPr>
+        <w:t>Stack: ESP32 Dual-Core FreeRTOS, R307 Biometrics, SIM800L GSM, MQ-2 Gas Sensors, DS18B20 Temp, Solenoid Lock, PHP/MySQL, ISO/IEC 25010 Benchmarks</w:t>
+      </w:r>
+    </w:p>
+    <w:p>
+      <w:pPr>
+        <w:spacing w:after="80"/>
+      </w:pPr>
+      <w:r>
+        <w:t>Researched and engineered official collegiate BSIT Capstone Thesis (Chapters 1â€“3 Complete). Architected dual-core ESP32 FreeRTOS firmware with hardware pin segregation, multi-sensor electrochemical gas and temperature fusion, optical biometric fingerprint authorization, autonomous SIM800L cellular SMS failover during network outages, and a predictive least-squares linear regression trend-analysis algorithm for early hazard escalation detection evaluated under ISO/IEC 25010 software quality benchmarks (N = 45 Evaluators).</w:t>
       </w:r>
     </w:p>
     <!-- Project 2 -->
@@ -268,26 +268,26 @@
         <w:rPr>
           <w:b/>
         </w:rPr>
-        <w:t>2 Oracle AI Metaphysical Guide Token Recharge System</w:t>
-      </w:r>
-    </w:p>
-    <w:p>
-      <w:pPr>
-        <w:spacing w:after="20"/>
-      </w:pPr>
-      <w:r>
-        <w:rPr>
-          <w:color w:val="1D4ED8"/>
-        </w:rPr>
-        <w:t>Stack Google Gemini API gemini38flash PayMongo API Gmail Session Authentication LocalStorage</w:t>
-      </w:r>
-    </w:p>
-    <w:p>
-      <w:pPr>
-        <w:spacing w:after="80"/>
-      </w:pPr>
-      <w:r>
-        <w:t>Built an AI spiritual conversational companion querying Google Generative Language endpoints Enforces Gmail authentication manages 5 free daily insights with 24hour reset timers and features a PayMongo Cosmic Token Store for instant digital wallet topups</w:t>
+        <w:t>2. DATAMEX College HRIS &amp; Biometric Payroll Automation Portal</w:t>
+      </w:r>
+    </w:p>
+    <w:p>
+      <w:pPr>
+        <w:spacing w:after="20"/>
+      </w:pPr>
+      <w:r>
+        <w:rPr>
+          <w:color w:val="1D4ED8"/>
+        </w:rPr>
+        <w:t>Stack: PHP 8.2, MySQL 3NF InnoDB, FPDF Library, JavaScript ES6+, Bootstrap 5</w:t>
+      </w:r>
+    </w:p>
+    <w:p>
+      <w:pPr>
+        <w:spacing w:after="80"/>
+      </w:pPr>
+      <w:r>
+        <w:t>Developed an institutional HR portal featuring touchscreen barcode kiosk attendance check-ins, automated 15-day salary calculations complying with Philippine statutory contributions (SSS, PhilHealth, Pag-IBIG), automated digital PDF payslips via FPDF, and campus bulletin board announcements.</w:t>
       </w:r>
     </w:p>
     <!-- Project 3 -->
@@ -299,26 +299,26 @@
         <w:rPr>
           <w:b/>
         </w:rPr>
-        <w:t>3 DATAMEX College HRIS Payroll Automation Portal</w:t>
-      </w:r>
-    </w:p>
-    <w:p>
-      <w:pPr>
-        <w:spacing w:after="20"/>
-      </w:pPr>
-      <w:r>
-        <w:rPr>
-          <w:color w:val="1D4ED8"/>
-        </w:rPr>
-        <w:t>Stack PHP 82 MySQL 3NF FPDF Library JavaScript Bootstrap 5</w:t>
-      </w:r>
-    </w:p>
-    <w:p>
-      <w:pPr>
-        <w:spacing w:after="80"/>
-      </w:pPr>
-      <w:r>
-        <w:t>Developed an HR portal featuring touchscreen barcode kiosk attendance checkins automated 15day salary calculations complying with Philippine statutory contributions SSS PhilHealth PagIBIG automated digital PDF payslips via FPDF and campus bulletin boards</w:t>
+        <w:t>3. Mythic Gambit: Tactical 2.5D / Isometric Strategy Chess Game Engine</w:t>
+      </w:r>
+    </w:p>
+    <w:p>
+      <w:pPr>
+        <w:spacing w:after="20"/>
+      </w:pPr>
+      <w:r>
+        <w:rPr>
+          <w:color w:val="1D4ED8"/>
+        </w:rPr>
+        <w:t>Stack: HTML5 Canvas (Dual-Mode 2D Tactical &amp; 2.5D Isometric), Web Audio API Synthesizer, Minimax AI (Alpha-Beta Pruning)</w:t>
+      </w:r>
+    </w:p>
+    <w:p>
+      <w:pPr>
+        <w:spacing w:after="80"/>
+      </w:pPr>
+      <w:r>
+        <w:t>Engineered an interactive playable browser turn-based strategy game engine with multi-perspective camera angles (Top-down, Isometric, Perspective), custom procedural audio synthesizer, Minimax AI adversary with recursive heuristic tree search, 15 kingdom lore and passive combat abilities, and authored a 44.6 MB Game Design Document (GDD).</w:t>
       </w:r>
     </w:p>
     <!-- Project 4 -->
@@ -330,18 +330,111 @@
         <w:rPr>
           <w:b/>
         </w:rPr>
-        <w:t>4 Arduino IoT Soil Moisture Telemetry System w Audio Buzzer</w:t>
-      </w:r>
-    </w:p>
-    <w:p>
-      <w:pPr>
-        <w:spacing w:after="20"/>
-      </w:pPr>
-      <w:r>
-        <w:rPr>
-          <w:color w:val="1D4ED8"/>
-        </w:rPr>
-        <w:t>Stack Arduino Uno R3 C Embedded Firmware Capacitive Probe PWM Speaker Breadboard</w:t>
+        <w:t>4. TarotKnight Crystal Art Sacred Luxury E-Commerce Platform (SmartShop)</w:t>
+      </w:r>
+    </w:p>
+    <w:p>
+      <w:pPr>
+        <w:spacing w:after="20"/>
+      </w:pPr>
+      <w:r>
+        <w:rPr>
+          <w:color w:val="1D4ED8"/>
+        </w:rPr>
+        <w:t>Stack: JavaScript ES6+, Bootstrap 5.3, PayMongo API, J&amp;T Express Logistics, MySQL 3NF, LocalStorage Persistence</w:t>
+      </w:r>
+    </w:p>
+    <w:p>
+      <w:pPr>
+        <w:spacing w:after="80"/>
+      </w:pPr>
+      <w:r>
+        <w:t>Engineered an authentic 44-item artisanal jewelry catalog with dynamic category filtering across Pendants, Bracelets, Rings, and Earrings. Integrated PayMongo test gateway (GCash, Maya, Cards), simulated J&amp;T Express waybill tracking, atomic stock decrementing to eliminate race conditions under concurrent checkouts, appointment calendar reservation, and an Administrative Control Center monitoring gross settled revenue.</w:t>
+      </w:r>
+    </w:p>
+    <!-- Project 5 -->
+    <w:p>
+      <w:pPr>
+        <w:spacing w:after="20"/>
+      </w:pPr>
+      <w:r>
+        <w:rPr>
+          <w:b/>
+        </w:rPr>
+        <w:t>5. Commercial Telemetry &amp; Financial Sales Data Analytics Dashboard</w:t>
+      </w:r>
+    </w:p>
+    <w:p>
+      <w:pPr>
+        <w:spacing w:after="20"/>
+      </w:pPr>
+      <w:r>
+        <w:rPr>
+          <w:color w:val="1D4ED8"/>
+        </w:rPr>
+        <w:t>Stack: Microsoft Excel Advanced Modeling, CORREL, Variance, ANOVA, Descriptive Statistics, JavaScript Canvas Charts</w:t>
+      </w:r>
+    </w:p>
+    <w:p>
+      <w:pPr>
+        <w:spacing w:after="80"/>
+      </w:pPr>
+      <w:r>
+        <w:t>Conducted end-to-end data processing and financial correlation modeling across 50 transaction records (â‚±9,690 revenue). Executed 12 analytical tasks covering data dictionary structuring, dynamic hourly station rate modeling, multi-condition nested IF categorizations, Pearson r correlation matrices (r = 0.84 between internet duration and beverage gross sales), and executive strategic recommendations.</w:t>
+      </w:r>
+    </w:p>
+    <!-- Project 6 -->
+    <w:p>
+      <w:pPr>
+        <w:spacing w:after="20"/>
+      </w:pPr>
+      <w:r>
+        <w:rPr>
+          <w:b/>
+        </w:rPr>
+        <w:t>6. Arduino IoT Soil Moisture Telemetry System w/ Audio Buzzer &amp; 3D Visualizer</w:t>
+      </w:r>
+    </w:p>
+    <w:p>
+      <w:pPr>
+        <w:spacing w:after="20"/>
+      </w:pPr>
+      <w:r>
+        <w:rPr>
+          <w:color w:val="1D4ED8"/>
+        </w:rPr>
+        <w:t>Stack: Arduino Uno R3, Embedded C++, Three.js 3D Plant Model, Capacitive Probe, PWM Speaker, Breadboard</w:t>
+      </w:r>
+    </w:p>
+    <w:p>
+      <w:pPr>
+        <w:spacing w:after="80"/>
+      </w:pPr>
+      <w:r>
+        <w:t>Engineered an embedded hydration monitor utilizing floating-point ratio math, 1000Hz PWM audio alert triggers on critically dry soil (dry threshold &lt; 10%), automated relay pump logic, Three.js 3D leaf moisture deformation shaders, and 9600-baud UART serial logging for plant precision agriculture.</w:t>
+      </w:r>
+    </w:p>
+    <!-- Project 7 -->
+    <w:p>
+      <w:pPr>
+        <w:spacing w:after="20"/>
+      </w:pPr>
+      <w:r>
+        <w:rPr>
+          <w:b/>
+        </w:rPr>
+        <w:t>7. Oracle AI Metaphysical &amp; Diagnostic Guide Token Recharge System</w:t>
+      </w:r>
+    </w:p>
+    <w:p>
+      <w:pPr>
+        <w:spacing w:after="20"/>
+      </w:pPr>
+      <w:r>
+        <w:rPr>
+          <w:color w:val="1D4ED8"/>
+        </w:rPr>
+        <w:t>Stack: Google Gemini API (gemini-3.8-flash), PayMongo API, Gmail Session Authentication, LocalStorage</w:t>
       </w:r>
     </w:p>
     <w:p>
@@ -349,7 +442,7 @@
         <w:spacing w:after="120"/>
       </w:pPr>
       <w:r>
-        <w:t>Engineered an embedded hydration monitor utilizing floatingpoint ratio math 1000Hz PWM audio alert triggers on critically dry soil dry threshold 10 dual status LEDs and 9600 baud UART serial logging for plant precision agriculture</w:t>
+        <w:t>Built an AI spiritual and technical conversational companion querying Google Generative Language endpoints. Enforces Gmail authentication, manages 5 free daily insights with 24-hour reset timers, and features a PayMongo Cosmic Token Store for instant digital wallet top-ups.</w:t>
       </w:r>
     </w:p>
     <!-- SECTION: PROFESSIONAL WORK EXPERIENCE -->

</xml_diff>